<commit_message>
v1.1 Word release: caption fonts, hanging bullet indents, Vendor Z cell
- Table 3 and 4 captions keep the designed caption runs' formatting (they had fallen back to the default font)
- bullets use hanging indents and tab stops instead of leading spaces
- paragraphs carrying a long repository path are left-aligned (justification stretched them)
- Vendor Z's cell reads 76.9; footnote 5 names the model
</commit_message>
<xml_diff>
--- a/releases/acropolis-v1.1.docx
+++ b/releases/acropolis-v1.1.docx
@@ -9579,7 +9579,10 @@
     <w:p>
       <w:pPr>
         <w:pStyle w:val="BodyText"/>
-        <w:ind w:right="-284"/>
+        <w:tabs>
+          <w:tab w:pos="360" w:val="left"/>
+        </w:tabs>
+        <w:ind w:right="-284" w:left="360" w:hanging="259"/>
         <w:jc w:val="both"/>
         <w:rPr>
           <w:rFonts w:ascii="Mignon" w:hAnsi="Mignon"/>
@@ -9589,7 +9592,114 @@
         <w:rPr>
           <w:rFonts w:ascii="Mignon" w:hAnsi="Mignon"/>
         </w:rPr>
-        <w:t>• event ordering: the topics to order;</w:t>
+        <w:t>•</w:t>
+        <w:tab/>
+        <w:t>event ordering: the topics to order;</w:t>
+      </w:r>
+    </w:p>
+    <w:p>
+      <w:pPr>
+        <w:pStyle w:val="BodyText"/>
+        <w:tabs>
+          <w:tab w:pos="360" w:val="left"/>
+        </w:tabs>
+        <w:ind w:right="-284" w:left="360" w:hanging="259"/>
+        <w:jc w:val="both"/>
+        <w:rPr>
+          <w:rFonts w:ascii="Mignon" w:hAnsi="Mignon"/>
+        </w:rPr>
+      </w:pPr>
+      <w:r>
+        <w:rPr>
+          <w:rFonts w:ascii="Mignon" w:hAnsi="Mignon"/>
+        </w:rPr>
+        <w:t>•</w:t>
+        <w:tab/>
+        <w:t>summarization: the rubric items the summary must cover;</w:t>
+      </w:r>
+    </w:p>
+    <w:p>
+      <w:pPr>
+        <w:pStyle w:val="BodyText"/>
+        <w:tabs>
+          <w:tab w:pos="360" w:val="left"/>
+        </w:tabs>
+        <w:ind w:right="-284" w:left="360" w:hanging="259"/>
+        <w:jc w:val="both"/>
+        <w:rPr>
+          <w:rFonts w:ascii="Mignon" w:hAnsi="Mignon"/>
+        </w:rPr>
+      </w:pPr>
+      <w:r>
+        <w:rPr>
+          <w:rFonts w:ascii="Mignon" w:hAnsi="Mignon"/>
+        </w:rPr>
+        <w:t>•</w:t>
+        <w:tab/>
+        <w:t>preference following: the preference under test;</w:t>
+      </w:r>
+    </w:p>
+    <w:p>
+      <w:pPr>
+        <w:pStyle w:val="BodyText"/>
+        <w:tabs>
+          <w:tab w:pos="360" w:val="left"/>
+        </w:tabs>
+        <w:ind w:right="-284" w:left="360" w:hanging="259"/>
+        <w:jc w:val="both"/>
+        <w:rPr>
+          <w:rFonts w:ascii="Mignon" w:hAnsi="Mignon"/>
+        </w:rPr>
+      </w:pPr>
+      <w:r>
+        <w:rPr>
+          <w:rFonts w:ascii="Mignon" w:hAnsi="Mignon"/>
+        </w:rPr>
+        <w:t>•</w:t>
+        <w:tab/>
+        <w:t>instruction following: the instruction and its compliance indicators;</w:t>
+      </w:r>
+    </w:p>
+    <w:p>
+      <w:pPr>
+        <w:pStyle w:val="BodyText"/>
+        <w:tabs>
+          <w:tab w:pos="360" w:val="left"/>
+        </w:tabs>
+        <w:ind w:right="-284" w:left="360" w:hanging="259"/>
+        <w:jc w:val="both"/>
+        <w:rPr>
+          <w:rFonts w:ascii="Mignon" w:hAnsi="Mignon"/>
+        </w:rPr>
+      </w:pPr>
+      <w:r>
+        <w:rPr>
+          <w:rFonts w:ascii="Mignon" w:hAnsi="Mignon"/>
+        </w:rPr>
+        <w:t>•</w:t>
+        <w:tab/>
+        <w:t>abstention: why the question may be unanswerable;</w:t>
+      </w:r>
+    </w:p>
+    <w:p>
+      <w:pPr>
+        <w:pStyle w:val="BodyText"/>
+        <w:tabs>
+          <w:tab w:pos="360" w:val="left"/>
+        </w:tabs>
+        <w:ind w:right="-284" w:left="360" w:hanging="259"/>
+        <w:jc w:val="both"/>
+        <w:rPr>
+          <w:rFonts w:ascii="Mignon" w:hAnsi="Mignon"/>
+        </w:rPr>
+      </w:pPr>
+      <w:r>
+        <w:rPr>
+          <w:rFonts w:ascii="Mignon" w:hAnsi="Mignon"/>
+        </w:rPr>
+        <w:t>•</w:t>
+        <w:tab/>
+        <w:t>temporal reasoning: the key time points and a calculation hint.</w:t>
       </w:r>
     </w:p>
     <w:p>
@@ -9605,7 +9715,49 @@
         <w:rPr>
           <w:rFonts w:ascii="Mignon" w:hAnsi="Mignon"/>
         </w:rPr>
-        <w:t>• summarization: the rubric items the summary must cover;</w:t>
+        <w:t>Its event-ordering score is Kendall tau-b mapped to 0–1, so an unrelated order earns about half credit. Our protocol uses BEAM's published tau × F1, which also requires naming the expected items. To compare on equal terms, we re-scored the evidence Acropolis retrieved in the September BEAM 100K runs under that protocol, with nothing re-retrieved, using two models:</w:t>
+      </w:r>
+    </w:p>
+    <w:p>
+      <w:pPr>
+        <w:pStyle w:val="BodyText"/>
+        <w:tabs>
+          <w:tab w:pos="360" w:val="left"/>
+        </w:tabs>
+        <w:ind w:right="-284" w:left="360" w:hanging="259"/>
+        <w:jc w:val="both"/>
+        <w:rPr>
+          <w:rFonts w:ascii="Mignon" w:hAnsi="Mignon"/>
+        </w:rPr>
+      </w:pPr>
+      <w:r>
+        <w:rPr>
+          <w:rFonts w:ascii="Mignon" w:hAnsi="Mignon"/>
+        </w:rPr>
+        <w:t>•</w:t>
+        <w:tab/>
+        <w:t>the leading figure's own setup: one frontier model, gpt-5.6-luna, answers and judges with reasoning off;</w:t>
+      </w:r>
+    </w:p>
+    <w:p>
+      <w:pPr>
+        <w:pStyle w:val="BodyText"/>
+        <w:tabs>
+          <w:tab w:pos="360" w:val="left"/>
+        </w:tabs>
+        <w:ind w:right="-284" w:left="360" w:hanging="259"/>
+        <w:jc w:val="both"/>
+        <w:rPr>
+          <w:rFonts w:ascii="Mignon" w:hAnsi="Mignon"/>
+        </w:rPr>
+      </w:pPr>
+      <w:r>
+        <w:rPr>
+          <w:rFonts w:ascii="Mignon" w:hAnsi="Mignon"/>
+        </w:rPr>
+        <w:t>•</w:t>
+        <w:tab/>
+        <w:t>our answer and judge model, gemini-3.7-flash.</w:t>
       </w:r>
     </w:p>
     <w:p>
@@ -9621,136 +9773,30 @@
         <w:rPr>
           <w:rFonts w:ascii="Mignon" w:hAnsi="Mignon"/>
         </w:rPr>
-        <w:t>• preference following: the preference under test;</w:t>
+        <w:t>Appendix A.11 gives the method and its checks.</w:t>
       </w:r>
     </w:p>
     <w:p>
       <w:pPr>
         <w:pStyle w:val="BodyText"/>
         <w:ind w:right="-284"/>
-        <w:jc w:val="both"/>
-        <w:rPr>
-          <w:rFonts w:ascii="Mignon" w:hAnsi="Mignon"/>
-        </w:rPr>
-      </w:pPr>
-      <w:r>
-        <w:rPr>
-          <w:rFonts w:ascii="Mignon" w:hAnsi="Mignon"/>
-        </w:rPr>
-        <w:t>• instruction following: the instruction and its compliance indicators;</w:t>
-      </w:r>
-    </w:p>
-    <w:p>
-      <w:pPr>
-        <w:pStyle w:val="BodyText"/>
-        <w:ind w:right="-284"/>
-        <w:jc w:val="both"/>
-        <w:rPr>
-          <w:rFonts w:ascii="Mignon" w:hAnsi="Mignon"/>
-        </w:rPr>
-      </w:pPr>
-      <w:r>
-        <w:rPr>
-          <w:rFonts w:ascii="Mignon" w:hAnsi="Mignon"/>
-        </w:rPr>
-        <w:t>• abstention: why the question may be unanswerable;</w:t>
-      </w:r>
-    </w:p>
-    <w:p>
-      <w:pPr>
-        <w:pStyle w:val="BodyText"/>
-        <w:ind w:right="-284"/>
-        <w:jc w:val="both"/>
-        <w:rPr>
-          <w:rFonts w:ascii="Mignon" w:hAnsi="Mignon"/>
-        </w:rPr>
-      </w:pPr>
-      <w:r>
-        <w:rPr>
-          <w:rFonts w:ascii="Mignon" w:hAnsi="Mignon"/>
-        </w:rPr>
-        <w:t>• temporal reasoning: the key time points and a calculation hint.</w:t>
-      </w:r>
-    </w:p>
-    <w:p>
-      <w:pPr>
-        <w:pStyle w:val="BodyText"/>
-        <w:ind w:right="-284"/>
-        <w:jc w:val="both"/>
-        <w:rPr>
-          <w:rFonts w:ascii="Mignon" w:hAnsi="Mignon"/>
-        </w:rPr>
-      </w:pPr>
-      <w:r>
-        <w:rPr>
-          <w:rFonts w:ascii="Mignon" w:hAnsi="Mignon"/>
-        </w:rPr>
-        <w:t>Its event-ordering score is Kendall tau-b mapped to 0–1, so an unrelated order earns about half credit. Our protocol uses BEAM's published tau × F1, which also requires naming the expected items. To compare on equal terms, we re-scored the evidence Acropolis retrieved in the September BEAM 100K runs under that protocol, with nothing re-retrieved, using two models:</w:t>
-      </w:r>
-    </w:p>
-    <w:p>
-      <w:pPr>
-        <w:pStyle w:val="BodyText"/>
-        <w:ind w:right="-284"/>
-        <w:jc w:val="both"/>
-        <w:rPr>
-          <w:rFonts w:ascii="Mignon" w:hAnsi="Mignon"/>
-        </w:rPr>
-      </w:pPr>
-      <w:r>
-        <w:rPr>
-          <w:rFonts w:ascii="Mignon" w:hAnsi="Mignon"/>
-        </w:rPr>
-        <w:t>• the leading figure's own setup: one frontier model, gpt-5.6-luna, answers and judges with reasoning off;</w:t>
-      </w:r>
-    </w:p>
-    <w:p>
-      <w:pPr>
-        <w:pStyle w:val="BodyText"/>
-        <w:ind w:right="-284"/>
-        <w:jc w:val="both"/>
-        <w:rPr>
-          <w:rFonts w:ascii="Mignon" w:hAnsi="Mignon"/>
-        </w:rPr>
-      </w:pPr>
-      <w:r>
-        <w:rPr>
-          <w:rFonts w:ascii="Mignon" w:hAnsi="Mignon"/>
-        </w:rPr>
-        <w:t>• our answer and judge model, gemini-3.7-flash.</w:t>
-      </w:r>
-    </w:p>
-    <w:p>
-      <w:pPr>
-        <w:pStyle w:val="BodyText"/>
-        <w:ind w:right="-284"/>
-        <w:jc w:val="both"/>
-        <w:rPr>
-          <w:rFonts w:ascii="Mignon" w:hAnsi="Mignon"/>
-        </w:rPr>
-      </w:pPr>
-      <w:r>
-        <w:rPr>
-          <w:rFonts w:ascii="Mignon" w:hAnsi="Mignon"/>
-        </w:rPr>
-        <w:t>Appendix A.11 gives the method and its checks.</w:t>
-      </w:r>
-    </w:p>
-    <w:p>
-      <w:pPr>
-        <w:pStyle w:val="BodyText"/>
-        <w:ind w:right="-284"/>
-        <w:rPr>
-          <w:rFonts w:ascii="Mignon" w:hAnsi="Mignon"/>
-        </w:rPr>
-      </w:pPr>
-      <w:r>
-        <w:rPr>
+        <w:jc w:val="left"/>
+        <w:rPr>
+          <w:rFonts w:ascii="Mignon" w:hAnsi="Mignon"/>
+        </w:rPr>
+      </w:pPr>
+      <w:r>
+        <w:rPr>
+          <w:rFonts w:ascii="Mignon" w:hAnsi="Mignon"/>
           <w:b/>
+          <w:bCs/>
         </w:rPr>
         <w:t>Table 3. BEAM 100K, 400 questions: our protocol and the published comparison protocol, on the same stored evidence.</w:t>
       </w:r>
       <w:r>
+        <w:rPr>
+          <w:rFonts w:ascii="Mignon" w:hAnsi="Mignon"/>
+        </w:rPr>
         <w:t xml:space="preserve"> Source: figures/table-3-beam100k-published-protocol.md; per-question records in reproduction/reports/beam/100k-published-protocol-2026-10/.</w:t>
       </w:r>
     </w:p>
@@ -11017,7 +11063,7 @@
                 <w:sz w:val="20"/>
                 <w:szCs w:val="20"/>
               </w:rPr>
-              <w:t>76.9 (Gemini 3 Flash)</w:t>
+              <w:t>76.9</w:t>
             </w:r>
           </w:p>
         </w:tc>
@@ -11102,17 +11148,23 @@
       <w:pPr>
         <w:pStyle w:val="BodyText"/>
         <w:ind w:right="-284"/>
-        <w:rPr>
-          <w:rFonts w:ascii="Mignon" w:hAnsi="Mignon"/>
-        </w:rPr>
-      </w:pPr>
-      <w:r>
-        <w:rPr>
+        <w:jc w:val="left"/>
+        <w:rPr>
+          <w:rFonts w:ascii="Mignon" w:hAnsi="Mignon"/>
+        </w:rPr>
+      </w:pPr>
+      <w:r>
+        <w:rPr>
+          <w:rFonts w:ascii="Mignon" w:hAnsi="Mignon"/>
           <w:b/>
+          <w:bCs/>
         </w:rPr>
         <w:t>Table 4. Where the distance between the two protocols comes from.</w:t>
       </w:r>
       <w:r>
+        <w:rPr>
+          <w:rFonts w:ascii="Mignon" w:hAnsi="Mignon"/>
+        </w:rPr>
         <w:t xml:space="preserve"> Local single call on the local brains (the first row of Table 3); each step changes one thing. Source: figures/table-4-protocol-distance.md.</w:t>
       </w:r>
     </w:p>
@@ -11827,7 +11879,10 @@
     <w:p>
       <w:pPr>
         <w:pStyle w:val="BodyText"/>
-        <w:ind w:right="-284"/>
+        <w:tabs>
+          <w:tab w:pos="360" w:val="left"/>
+        </w:tabs>
+        <w:ind w:right="-284" w:left="360" w:hanging="259"/>
         <w:jc w:val="both"/>
         <w:rPr>
           <w:rFonts w:ascii="Mignon" w:hAnsi="Mignon"/>
@@ -11837,7 +11892,8 @@
         <w:rPr>
           <w:rFonts w:ascii="Mignon" w:hAnsi="Mignon"/>
         </w:rPr>
-        <w:t xml:space="preserve">• </w:t>
+        <w:t>•</w:t>
+        <w:tab/>
       </w:r>
       <w:r>
         <w:rPr>
@@ -11851,6 +11907,72 @@
           <w:rFonts w:ascii="Mignon" w:hAnsi="Mignon"/>
         </w:rPr>
         <w:t xml:space="preserve"> The comparison judge scores the same answers higher; with gpt-5.6-luna judging, +11.4.</w:t>
+      </w:r>
+    </w:p>
+    <w:p>
+      <w:pPr>
+        <w:pStyle w:val="BodyText"/>
+        <w:tabs>
+          <w:tab w:pos="360" w:val="left"/>
+        </w:tabs>
+        <w:ind w:right="-284" w:left="360" w:hanging="259"/>
+        <w:jc w:val="both"/>
+        <w:rPr>
+          <w:rFonts w:ascii="Mignon" w:hAnsi="Mignon"/>
+        </w:rPr>
+      </w:pPr>
+      <w:r>
+        <w:rPr>
+          <w:rFonts w:ascii="Mignon" w:hAnsi="Mignon"/>
+        </w:rPr>
+        <w:t>•</w:t>
+        <w:tab/>
+      </w:r>
+      <w:r>
+        <w:rPr>
+          <w:rFonts w:ascii="Mignon" w:hAnsi="Mignon"/>
+          <w:b/>
+        </w:rPr>
+        <w:t>Our answer contract, +15.4.</w:t>
+      </w:r>
+      <w:r>
+        <w:rPr>
+          <w:rFonts w:ascii="Mignon" w:hAnsi="Mignon"/>
+        </w:rPr>
+        <w:t xml:space="preserve"> Its rule is to answer only from material that literally states the answer and otherwise to refuse. That rule is the governance property this paper measures, and on a benchmark that rewards answering it costs about 15 points.</w:t>
+      </w:r>
+    </w:p>
+    <w:p>
+      <w:pPr>
+        <w:pStyle w:val="BodyText"/>
+        <w:tabs>
+          <w:tab w:pos="360" w:val="left"/>
+        </w:tabs>
+        <w:ind w:right="-284" w:left="360" w:hanging="259"/>
+        <w:jc w:val="both"/>
+        <w:rPr>
+          <w:rFonts w:ascii="Mignon" w:hAnsi="Mignon"/>
+        </w:rPr>
+      </w:pPr>
+      <w:r>
+        <w:rPr>
+          <w:rFonts w:ascii="Mignon" w:hAnsi="Mignon"/>
+        </w:rPr>
+        <w:t>•</w:t>
+        <w:tab/>
+      </w:r>
+      <w:r>
+        <w:rPr>
+          <w:rFonts w:ascii="Mignon" w:hAnsi="Mignon"/>
+          <w:b/>
+        </w:rPr>
+        <w:t>The annotations, +11.1.</w:t>
+      </w:r>
+      <w:r>
+        <w:rPr>
+          <w:rFonts w:ascii="Mignon" w:hAnsi="Mignon"/>
+        </w:rPr>
+        <w:t xml:space="preserve"> All of it falls on the six annotated abilities; the four unannotated abilities move by less than a point. Under gpt-5.6-luna the annotations add 13.8, and event ordering reaches 100.0 because the model orders the list it is handed.</w:t>
       </w:r>
     </w:p>
     <w:p>
@@ -11866,20 +11988,7 @@
         <w:rPr>
           <w:rFonts w:ascii="Mignon" w:hAnsi="Mignon"/>
         </w:rPr>
-        <w:t xml:space="preserve">• </w:t>
-      </w:r>
-      <w:r>
-        <w:rPr>
-          <w:rFonts w:ascii="Mignon" w:hAnsi="Mignon"/>
-          <w:b/>
-        </w:rPr>
-        <w:t>Our answer contract, +15.4.</w:t>
-      </w:r>
-      <w:r>
-        <w:rPr>
-          <w:rFonts w:ascii="Mignon" w:hAnsi="Mignon"/>
-        </w:rPr>
-        <w:t xml:space="preserve"> Its rule is to answer only from material that literally states the answer and otherwise to refuse. That rule is the governance property this paper measures, and on a benchmark that rewards answering it costs about 15 points.</w:t>
+        <w:t>With the annotations removed, Acropolis evidence scores 74.1 (gemini-3.7-flash) and 74.0 (gpt-5.6-luna).</w:t>
       </w:r>
     </w:p>
     <w:p>
@@ -11895,26 +12004,16 @@
         <w:rPr>
           <w:rFonts w:ascii="Mignon" w:hAnsi="Mignon"/>
         </w:rPr>
-        <w:t xml:space="preserve">• </w:t>
-      </w:r>
-      <w:r>
-        <w:rPr>
-          <w:rFonts w:ascii="Mignon" w:hAnsi="Mignon"/>
-          <w:b/>
-        </w:rPr>
-        <w:t>The annotations, +11.1.</w:t>
-      </w:r>
-      <w:r>
-        <w:rPr>
-          <w:rFonts w:ascii="Mignon" w:hAnsi="Mignon"/>
-        </w:rPr>
-        <w:t xml:space="preserve"> All of it falls on the six annotated abilities; the four unannotated abilities move by less than a point. Under gpt-5.6-luna the annotations add 13.8, and event ordering reaches 100.0 because the model orders the list it is handed.</w:t>
+        <w:t>On the four abilities the annotations do not touch, the published protocol puts Acropolis at 75.9, against 82.9 for Vendor Y on the same four:</w:t>
       </w:r>
     </w:p>
     <w:p>
       <w:pPr>
         <w:pStyle w:val="BodyText"/>
-        <w:ind w:right="-284"/>
+        <w:tabs>
+          <w:tab w:pos="360" w:val="left"/>
+        </w:tabs>
+        <w:ind w:right="-284" w:left="360" w:hanging="259"/>
         <w:jc w:val="both"/>
         <w:rPr>
           <w:rFonts w:ascii="Mignon" w:hAnsi="Mignon"/>
@@ -11924,13 +12023,18 @@
         <w:rPr>
           <w:rFonts w:ascii="Mignon" w:hAnsi="Mignon"/>
         </w:rPr>
-        <w:t>With the annotations removed, Acropolis evidence scores 74.1 (gemini-3.7-flash) and 74.0 (gpt-5.6-luna).</w:t>
+        <w:t>•</w:t>
+        <w:tab/>
+        <w:t>knowledge update is most of the difference, 69.4 against 89.4; Vendor Y asks each knowledge-update question as of the update turn the dataset cites, which our re-scoring does not;</w:t>
       </w:r>
     </w:p>
     <w:p>
       <w:pPr>
         <w:pStyle w:val="BodyText"/>
-        <w:ind w:right="-284"/>
+        <w:tabs>
+          <w:tab w:pos="360" w:val="left"/>
+        </w:tabs>
+        <w:ind w:right="-284" w:left="360" w:hanging="259"/>
         <w:jc w:val="both"/>
         <w:rPr>
           <w:rFonts w:ascii="Mignon" w:hAnsi="Mignon"/>
@@ -11940,13 +12044,18 @@
         <w:rPr>
           <w:rFonts w:ascii="Mignon" w:hAnsi="Mignon"/>
         </w:rPr>
-        <w:t>On the four abilities the annotations do not touch, the published protocol puts Acropolis at 75.9, against 82.9 for Vendor Y on the same four:</w:t>
+        <w:t>•</w:t>
+        <w:tab/>
+        <w:t>contradiction resolution is 77.2 against 78.1;</w:t>
       </w:r>
     </w:p>
     <w:p>
       <w:pPr>
         <w:pStyle w:val="BodyText"/>
-        <w:ind w:right="-284"/>
+        <w:tabs>
+          <w:tab w:pos="360" w:val="left"/>
+        </w:tabs>
+        <w:ind w:right="-284" w:left="360" w:hanging="259"/>
         <w:jc w:val="both"/>
         <w:rPr>
           <w:rFonts w:ascii="Mignon" w:hAnsi="Mignon"/>
@@ -11956,39 +12065,9 @@
         <w:rPr>
           <w:rFonts w:ascii="Mignon" w:hAnsi="Mignon"/>
         </w:rPr>
-        <w:t>• knowledge update is most of the difference, 69.4 against 89.4; Vendor Y asks each knowledge-update question as of the update turn the dataset cites, which our re-scoring does not;</w:t>
-      </w:r>
-    </w:p>
-    <w:p>
-      <w:pPr>
-        <w:pStyle w:val="BodyText"/>
-        <w:ind w:right="-284"/>
-        <w:jc w:val="both"/>
-        <w:rPr>
-          <w:rFonts w:ascii="Mignon" w:hAnsi="Mignon"/>
-        </w:rPr>
-      </w:pPr>
-      <w:r>
-        <w:rPr>
-          <w:rFonts w:ascii="Mignon" w:hAnsi="Mignon"/>
-        </w:rPr>
-        <w:t>• contradiction resolution is 77.2 against 78.1;</w:t>
-      </w:r>
-    </w:p>
-    <w:p>
-      <w:pPr>
-        <w:pStyle w:val="BodyText"/>
-        <w:ind w:right="-284"/>
-        <w:jc w:val="both"/>
-        <w:rPr>
-          <w:rFonts w:ascii="Mignon" w:hAnsi="Mignon"/>
-        </w:rPr>
-      </w:pPr>
-      <w:r>
-        <w:rPr>
-          <w:rFonts w:ascii="Mignon" w:hAnsi="Mignon"/>
-        </w:rPr>
-        <w:t>• multi-session reasoning is 67.6 against 68.9.</w:t>
+        <w:t>•</w:t>
+        <w:tab/>
+        <w:t>multi-session reasoning is 67.6 against 68.9.</w:t>
       </w:r>
     </w:p>
     <w:p>
@@ -22518,7 +22597,7 @@
     <w:p>
       <w:pPr>
         <w:pStyle w:val="BodyText"/>
-        <w:jc w:val="both"/>
+        <w:jc w:val="left"/>
         <w:rPr>
           <w:rFonts w:ascii="Mignon" w:hAnsi="Mignon"/>
           <w:color w:val="000000" w:themeColor="text1"/>
@@ -22545,7 +22624,10 @@
     <w:p>
       <w:pPr>
         <w:pStyle w:val="BodyText"/>
-        <w:ind w:right="-284"/>
+        <w:tabs>
+          <w:tab w:pos="360" w:val="left"/>
+        </w:tabs>
+        <w:ind w:right="-284" w:left="360" w:hanging="259"/>
         <w:jc w:val="both"/>
         <w:rPr>
           <w:rFonts w:ascii="Mignon" w:hAnsi="Mignon"/>
@@ -22555,7 +22637,8 @@
         <w:rPr>
           <w:rFonts w:ascii="Mignon" w:hAnsi="Mignon"/>
         </w:rPr>
-        <w:t xml:space="preserve">• </w:t>
+        <w:t>•</w:t>
+        <w:tab/>
       </w:r>
       <w:r>
         <w:rPr>
@@ -22568,7 +22651,10 @@
     <w:p>
       <w:pPr>
         <w:pStyle w:val="BodyText"/>
-        <w:ind w:right="-284"/>
+        <w:tabs>
+          <w:tab w:pos="720" w:val="left"/>
+        </w:tabs>
+        <w:ind w:right="-284" w:left="720" w:hanging="259"/>
         <w:jc w:val="both"/>
         <w:rPr>
           <w:rFonts w:ascii="Mignon" w:hAnsi="Mignon"/>
@@ -22578,13 +22664,18 @@
         <w:rPr>
           <w:rFonts w:ascii="Mignon" w:hAnsi="Mignon"/>
         </w:rPr>
-        <w:t xml:space="preserve">    – Each question's evidence is the claims and observation excerpts the configuration's composer received in the September run, as saved in its ask report. Claim text is capped at 240 characters in the report; excerpts are kept at the server's 2,000.</w:t>
+        <w:t>–</w:t>
+        <w:tab/>
+        <w:t>Each question's evidence is the claims and observation excerpts the configuration's composer received in the September run, as saved in its ask report. Claim text is capped at 240 characters in the report; excerpts are kept at the server's 2,000.</w:t>
       </w:r>
     </w:p>
     <w:p>
       <w:pPr>
         <w:pStyle w:val="BodyText"/>
-        <w:ind w:right="-284"/>
+        <w:tabs>
+          <w:tab w:pos="720" w:val="left"/>
+        </w:tabs>
+        <w:ind w:right="-284" w:left="720" w:hanging="259"/>
         <w:jc w:val="both"/>
         <w:rPr>
           <w:rFonts w:ascii="Mignon" w:hAnsi="Mignon"/>
@@ -22594,13 +22685,18 @@
         <w:rPr>
           <w:rFonts w:ascii="Mignon" w:hAnsi="Mignon"/>
         </w:rPr>
-        <w:t xml:space="preserve">    – The evidence is passed as compact JSON in delivered order, with each excerpt's turn id and timestamp, in place of the adapter's recall response. Nothing is re-retrieved.</w:t>
+        <w:t>–</w:t>
+        <w:tab/>
+        <w:t>The evidence is passed as compact JSON in delivered order, with each excerpt's turn id and timestamp, in place of the adapter's recall response. Nothing is re-retrieved.</w:t>
       </w:r>
     </w:p>
     <w:p>
       <w:pPr>
         <w:pStyle w:val="BodyText"/>
-        <w:ind w:right="-284"/>
+        <w:tabs>
+          <w:tab w:pos="720" w:val="left"/>
+        </w:tabs>
+        <w:ind w:right="-284" w:left="720" w:hanging="259"/>
         <w:jc w:val="both"/>
         <w:rPr>
           <w:rFonts w:ascii="Mignon" w:hAnsi="Mignon"/>
@@ -22610,13 +22706,18 @@
         <w:rPr>
           <w:rFonts w:ascii="Mignon" w:hAnsi="Mignon"/>
         </w:rPr>
-        <w:t xml:space="preserve">    – An agentic row's evidence is what its report records as delivered to the composer.</w:t>
+        <w:t>–</w:t>
+        <w:tab/>
+        <w:t>An agentic row's evidence is what its report records as delivered to the composer.</w:t>
       </w:r>
     </w:p>
     <w:p>
       <w:pPr>
         <w:pStyle w:val="BodyText"/>
-        <w:ind w:right="-284"/>
+        <w:tabs>
+          <w:tab w:pos="360" w:val="left"/>
+        </w:tabs>
+        <w:ind w:right="-284" w:left="360" w:hanging="259"/>
         <w:jc w:val="both"/>
         <w:rPr>
           <w:rFonts w:ascii="Mignon" w:hAnsi="Mignon"/>
@@ -22626,7 +22727,8 @@
         <w:rPr>
           <w:rFonts w:ascii="Mignon" w:hAnsi="Mignon"/>
         </w:rPr>
-        <w:t xml:space="preserve">• </w:t>
+        <w:t>•</w:t>
+        <w:tab/>
       </w:r>
       <w:r>
         <w:rPr>
@@ -22639,7 +22741,10 @@
     <w:p>
       <w:pPr>
         <w:pStyle w:val="BodyText"/>
-        <w:ind w:right="-284"/>
+        <w:tabs>
+          <w:tab w:pos="720" w:val="left"/>
+        </w:tabs>
+        <w:ind w:right="-284" w:left="720" w:hanging="259"/>
         <w:jc w:val="both"/>
         <w:rPr>
           <w:rFonts w:ascii="Mignon" w:hAnsi="Mignon"/>
@@ -22649,13 +22754,18 @@
         <w:rPr>
           <w:rFonts w:ascii="Mignon" w:hAnsi="Mignon"/>
         </w:rPr>
-        <w:t xml:space="preserve">    – The prompts are the adapter's, verbatim (file hashes in the manifest), and the scoring follows them:</w:t>
+        <w:t>–</w:t>
+        <w:tab/>
+        <w:t>The prompts are the adapter's, verbatim (file hashes in the manifest), and the scoring follows them:</w:t>
       </w:r>
     </w:p>
     <w:p>
       <w:pPr>
         <w:pStyle w:val="BodyText"/>
-        <w:ind w:right="-284"/>
+        <w:tabs>
+          <w:tab w:pos="1080" w:val="left"/>
+        </w:tabs>
+        <w:ind w:right="-284" w:left="1080" w:hanging="259"/>
         <w:jc w:val="both"/>
         <w:rPr>
           <w:rFonts w:ascii="Mignon" w:hAnsi="Mignon"/>
@@ -22665,13 +22775,18 @@
         <w:rPr>
           <w:rFonts w:ascii="Mignon" w:hAnsi="Mignon"/>
         </w:rPr>
-        <w:t xml:space="preserve">        · rubric items are judged one at a time and rounded to 0, 0.5 or 1;</w:t>
+        <w:t>·</w:t>
+        <w:tab/>
+        <w:t>rubric items are judged one at a time and rounded to 0, 0.5 or 1;</w:t>
       </w:r>
     </w:p>
     <w:p>
       <w:pPr>
         <w:pStyle w:val="BodyText"/>
-        <w:ind w:right="-284"/>
+        <w:tabs>
+          <w:tab w:pos="1080" w:val="left"/>
+        </w:tabs>
+        <w:ind w:right="-284" w:left="1080" w:hanging="259"/>
         <w:jc w:val="both"/>
         <w:rPr>
           <w:rFonts w:ascii="Mignon" w:hAnsi="Mignon"/>
@@ -22681,13 +22796,18 @@
         <w:rPr>
           <w:rFonts w:ascii="Mignon" w:hAnsi="Mignon"/>
         </w:rPr>
-        <w:t xml:space="preserve">        · event-ordering items are matched by an equivalence prompt and scored as Kendall tau-b mapped to 0–1;</w:t>
+        <w:t>·</w:t>
+        <w:tab/>
+        <w:t>event-ordering items are matched by an equivalence prompt and scored as Kendall tau-b mapped to 0–1;</w:t>
       </w:r>
     </w:p>
     <w:p>
       <w:pPr>
         <w:pStyle w:val="BodyText"/>
-        <w:ind w:right="-284"/>
+        <w:tabs>
+          <w:tab w:pos="1080" w:val="left"/>
+        </w:tabs>
+        <w:ind w:right="-284" w:left="1080" w:hanging="259"/>
         <w:jc w:val="both"/>
         <w:rPr>
           <w:rFonts w:ascii="Mignon" w:hAnsi="Mignon"/>
@@ -22697,13 +22817,18 @@
         <w:rPr>
           <w:rFonts w:ascii="Mignon" w:hAnsi="Mignon"/>
         </w:rPr>
-        <w:t xml:space="preserve">        · the overall figure is the mean over all 400 questions.</w:t>
+        <w:t>·</w:t>
+        <w:tab/>
+        <w:t>the overall figure is the mean over all 400 questions.</w:t>
       </w:r>
     </w:p>
     <w:p>
       <w:pPr>
         <w:pStyle w:val="BodyText"/>
-        <w:ind w:right="-284"/>
+        <w:tabs>
+          <w:tab w:pos="720" w:val="left"/>
+        </w:tabs>
+        <w:ind w:right="-284" w:left="720" w:hanging="259"/>
         <w:jc w:val="both"/>
         <w:rPr>
           <w:rFonts w:ascii="Mignon" w:hAnsi="Mignon"/>
@@ -22713,13 +22838,18 @@
         <w:rPr>
           <w:rFonts w:ascii="Mignon" w:hAnsi="Mignon"/>
         </w:rPr>
-        <w:t xml:space="preserve">    – The scorer reproduces the 2,000 published question scores of the leading vendor's public harness from its saved verdicts with no mismatch, at all four BEAM sizes. The 400 questions are identical in text to that harness's 100K set.</w:t>
+        <w:t>–</w:t>
+        <w:tab/>
+        <w:t>The scorer reproduces the 2,000 published question scores of the leading vendor's public harness from its saved verdicts with no mismatch, at all four BEAM sizes. The 400 questions are identical in text to that harness's 100K set.</w:t>
       </w:r>
     </w:p>
     <w:p>
       <w:pPr>
         <w:pStyle w:val="BodyText"/>
-        <w:ind w:right="-284"/>
+        <w:tabs>
+          <w:tab w:pos="360" w:val="left"/>
+        </w:tabs>
+        <w:ind w:right="-284" w:left="360" w:hanging="259"/>
         <w:jc w:val="both"/>
         <w:rPr>
           <w:rFonts w:ascii="Mignon" w:hAnsi="Mignon"/>
@@ -22729,7 +22859,8 @@
         <w:rPr>
           <w:rFonts w:ascii="Mignon" w:hAnsi="Mignon"/>
         </w:rPr>
-        <w:t xml:space="preserve">• </w:t>
+        <w:t>•</w:t>
+        <w:tab/>
       </w:r>
       <w:r>
         <w:rPr>
@@ -22742,7 +22873,10 @@
     <w:p>
       <w:pPr>
         <w:pStyle w:val="BodyText"/>
-        <w:ind w:right="-284"/>
+        <w:tabs>
+          <w:tab w:pos="720" w:val="left"/>
+        </w:tabs>
+        <w:ind w:right="-284" w:left="720" w:hanging="259"/>
         <w:jc w:val="both"/>
         <w:rPr>
           <w:rFonts w:ascii="Mignon" w:hAnsi="Mignon"/>
@@ -22752,13 +22886,18 @@
         <w:rPr>
           <w:rFonts w:ascii="Mignon" w:hAnsi="Mignon"/>
         </w:rPr>
-        <w:t xml:space="preserve">    – gpt-5.6-luna with reasoning off answers and judges, as in the leading published run.</w:t>
+        <w:t>–</w:t>
+        <w:tab/>
+        <w:t>gpt-5.6-luna with reasoning off answers and judges, as in the leading published run.</w:t>
       </w:r>
     </w:p>
     <w:p>
       <w:pPr>
         <w:pStyle w:val="BodyText"/>
-        <w:ind w:right="-284"/>
+        <w:tabs>
+          <w:tab w:pos="720" w:val="left"/>
+        </w:tabs>
+        <w:ind w:right="-284" w:left="720" w:hanging="259"/>
         <w:jc w:val="both"/>
         <w:rPr>
           <w:rFonts w:ascii="Mignon" w:hAnsi="Mignon"/>
@@ -22768,13 +22907,18 @@
         <w:rPr>
           <w:rFonts w:ascii="Mignon" w:hAnsi="Mignon"/>
         </w:rPr>
-        <w:t xml:space="preserve">    – gemini-3.7-flash answers and judges its own rows, with reasoning "minimal", because the endpoint refuses "none".</w:t>
+        <w:t>–</w:t>
+        <w:tab/>
+        <w:t>gemini-3.7-flash answers and judges its own rows, with reasoning "minimal", because the endpoint refuses "none".</w:t>
       </w:r>
     </w:p>
     <w:p>
       <w:pPr>
         <w:pStyle w:val="BodyText"/>
-        <w:ind w:right="-284"/>
+        <w:tabs>
+          <w:tab w:pos="720" w:val="left"/>
+        </w:tabs>
+        <w:ind w:right="-284" w:left="720" w:hanging="259"/>
         <w:jc w:val="both"/>
         <w:rPr>
           <w:rFonts w:ascii="Mignon" w:hAnsi="Mignon"/>
@@ -22784,13 +22928,18 @@
         <w:rPr>
           <w:rFonts w:ascii="Mignon" w:hAnsi="Mignon"/>
         </w:rPr>
-        <w:t xml:space="preserve">    – Output is capped at 8,000 tokens to bound the provider's in-flight credit reservation; no reply in the runs exceeded 3,740 tokens.</w:t>
+        <w:t>–</w:t>
+        <w:tab/>
+        <w:t>Output is capped at 8,000 tokens to bound the provider's in-flight credit reservation; no reply in the runs exceeded 3,740 tokens.</w:t>
       </w:r>
     </w:p>
     <w:p>
       <w:pPr>
         <w:pStyle w:val="BodyText"/>
-        <w:ind w:right="-284"/>
+        <w:tabs>
+          <w:tab w:pos="360" w:val="left"/>
+        </w:tabs>
+        <w:ind w:right="-284" w:left="360" w:hanging="259"/>
         <w:jc w:val="both"/>
         <w:rPr>
           <w:rFonts w:ascii="Mignon" w:hAnsi="Mignon"/>
@@ -22800,7 +22949,8 @@
         <w:rPr>
           <w:rFonts w:ascii="Mignon" w:hAnsi="Mignon"/>
         </w:rPr>
-        <w:t xml:space="preserve">• </w:t>
+        <w:t>•</w:t>
+        <w:tab/>
       </w:r>
       <w:r>
         <w:rPr>
@@ -22813,7 +22963,10 @@
     <w:p>
       <w:pPr>
         <w:pStyle w:val="BodyText"/>
-        <w:ind w:right="-284"/>
+        <w:tabs>
+          <w:tab w:pos="720" w:val="left"/>
+        </w:tabs>
+        <w:ind w:right="-284" w:left="720" w:hanging="259"/>
         <w:jc w:val="both"/>
         <w:rPr>
           <w:rFonts w:ascii="Mignon" w:hAnsi="Mignon"/>
@@ -22823,13 +22976,18 @@
         <w:rPr>
           <w:rFonts w:ascii="Mignon" w:hAnsi="Mignon"/>
         </w:rPr>
-        <w:t xml:space="preserve">    – Annotations removed: the per-ability instructions kept and the dataset annotations withheld from the answer prompt, judge unchanged.</w:t>
+        <w:t>–</w:t>
+        <w:tab/>
+        <w:t>Annotations removed: the per-ability instructions kept and the dataset annotations withheld from the answer prompt, judge unchanged.</w:t>
       </w:r>
     </w:p>
     <w:p>
       <w:pPr>
         <w:pStyle w:val="BodyText"/>
-        <w:ind w:right="-284"/>
+        <w:tabs>
+          <w:tab w:pos="720" w:val="left"/>
+        </w:tabs>
+        <w:ind w:right="-284" w:left="720" w:hanging="259"/>
         <w:jc w:val="both"/>
         <w:rPr>
           <w:rFonts w:ascii="Mignon" w:hAnsi="Mignon"/>
@@ -22839,13 +22997,18 @@
         <w:rPr>
           <w:rFonts w:ascii="Mignon" w:hAnsi="Mignon"/>
         </w:rPr>
-        <w:t xml:space="preserve">    – Native answers re-judged: the September composer's stored answers, scored by the adapter's judge, with no new answers. An abstaining composer's stored answer is its contractual refusal token. Nine local single-call answers were empty in the stored reports and score 0, as the adapter scores a failed answer.</w:t>
+        <w:t>–</w:t>
+        <w:tab/>
+        <w:t>Native answers re-judged: the September composer's stored answers, scored by the adapter's judge, with no new answers. An abstaining composer's stored answer is its contractual refusal token. Nine local single-call answers were empty in the stored reports and score 0, as the adapter scores a failed answer.</w:t>
       </w:r>
     </w:p>
     <w:p>
       <w:pPr>
         <w:pStyle w:val="BodyText"/>
-        <w:ind w:right="-284"/>
+        <w:tabs>
+          <w:tab w:pos="360" w:val="left"/>
+        </w:tabs>
+        <w:ind w:right="-284" w:left="360" w:hanging="259"/>
         <w:jc w:val="both"/>
         <w:rPr>
           <w:rFonts w:ascii="Mignon" w:hAnsi="Mignon"/>
@@ -22855,7 +23018,8 @@
         <w:rPr>
           <w:rFonts w:ascii="Mignon" w:hAnsi="Mignon"/>
         </w:rPr>
-        <w:t xml:space="preserve">• </w:t>
+        <w:t>•</w:t>
+        <w:tab/>
       </w:r>
       <w:r>
         <w:rPr>
@@ -22868,7 +23032,10 @@
     <w:p>
       <w:pPr>
         <w:pStyle w:val="BodyText"/>
-        <w:ind w:right="-284"/>
+        <w:tabs>
+          <w:tab w:pos="720" w:val="left"/>
+        </w:tabs>
+        <w:ind w:right="-284" w:left="720" w:hanging="259"/>
         <w:jc w:val="both"/>
         <w:rPr>
           <w:rFonts w:ascii="Mignon" w:hAnsi="Mignon"/>
@@ -22878,13 +23045,18 @@
         <w:rPr>
           <w:rFonts w:ascii="Mignon" w:hAnsi="Mignon"/>
         </w:rPr>
-        <w:t xml:space="preserve">    – Knowledge-update questions are asked as of the end of the conversation, not as of the update turn the dataset cites.</w:t>
+        <w:t>–</w:t>
+        <w:tab/>
+        <w:t>Knowledge-update questions are asked as of the end of the conversation, not as of the update turn the dataset cites.</w:t>
       </w:r>
     </w:p>
     <w:p>
       <w:pPr>
         <w:pStyle w:val="BodyText"/>
-        <w:ind w:right="-284"/>
+        <w:tabs>
+          <w:tab w:pos="720" w:val="left"/>
+        </w:tabs>
+        <w:ind w:right="-284" w:left="720" w:hanging="259"/>
         <w:jc w:val="both"/>
         <w:rPr>
           <w:rFonts w:ascii="Mignon" w:hAnsi="Mignon"/>
@@ -22894,13 +23066,18 @@
         <w:rPr>
           <w:rFonts w:ascii="Mignon" w:hAnsi="Mignon"/>
         </w:rPr>
-        <w:t xml:space="preserve">    – The evidence budget is ours rather than the leading run's 8,000 evidence tokens: the median prompt is about 7,500 tokens and the mean about 23,000, because synthesis questions carry the largest envelopes.</w:t>
+        <w:t>–</w:t>
+        <w:tab/>
+        <w:t>The evidence budget is ours rather than the leading run's 8,000 evidence tokens: the median prompt is about 7,500 tokens and the mean about 23,000, because synthesis questions carry the largest envelopes.</w:t>
       </w:r>
     </w:p>
     <w:p>
       <w:pPr>
         <w:pStyle w:val="BodyText"/>
-        <w:ind w:right="-284"/>
+        <w:tabs>
+          <w:tab w:pos="360" w:val="left"/>
+        </w:tabs>
+        <w:ind w:right="-284" w:left="360" w:hanging="259"/>
         <w:jc w:val="both"/>
         <w:rPr>
           <w:rFonts w:ascii="Mignon" w:hAnsi="Mignon"/>
@@ -22910,7 +23087,8 @@
         <w:rPr>
           <w:rFonts w:ascii="Mignon" w:hAnsi="Mignon"/>
         </w:rPr>
-        <w:t xml:space="preserve">• </w:t>
+        <w:t>•</w:t>
+        <w:tab/>
       </w:r>
       <w:r>
         <w:rPr>

</xml_diff>

<commit_message>
v1.1: say that no Table 3 row is fully local under the comparison protocol
The protocol's model writes every answer there, so the configuration names describe how the
record was built and the evidence retrieved. The PDF is re-exported with the v1.1 DOI swap.
</commit_message>
<xml_diff>
--- a/releases/acropolis-v1.1.docx
+++ b/releases/acropolis-v1.1.docx
@@ -11110,6 +11110,22 @@
           <w:rFonts w:ascii="Mignon" w:hAnsi="Mignon"/>
         </w:rPr>
         <w:t>● Every Acropolis cell has per-question records with saved verdicts in the bundle; verify.py recomputes each score from them.</w:t>
+      </w:r>
+    </w:p>
+    <w:p>
+      <w:pPr>
+        <w:pStyle w:val="BodyText"/>
+        <w:ind w:right="-284"/>
+        <w:jc w:val="both"/>
+        <w:rPr>
+          <w:rFonts w:ascii="Mignon" w:hAnsi="Mignon"/>
+        </w:rPr>
+      </w:pPr>
+      <w:r>
+        <w:rPr>
+          <w:rFonts w:ascii="Mignon" w:hAnsi="Mignon"/>
+        </w:rPr>
+        <w:t>Under the comparison protocol the protocol's model writes every answer, so no row of Table 3 is fully local there: the configuration names say how the record was built and the evidence retrieved, and only the first two columns measure each configuration's own answer seat.</w:t>
       </w:r>
     </w:p>
     <w:p>

</xml_diff>